<commit_message>
docs: put operation guide steps on separate numbered lines
</commit_message>
<xml_diff>
--- a/tutorial/DeepSeek-Pilot简明操作文档.docx
+++ b/tutorial/DeepSeek-Pilot简明操作文档.docx
@@ -30,7 +30,17 @@
     </w:p>
     <w:p>
       <w:r>
-        <w:t>将插件 ZIP 解压到固定目录。下载完整仓库时，加载其中的 core 文件夹；如果拿到单独的 Chrome 插件包，加载解压后直接包含 manifest.json 的文件夹。Edge 和 Chrome 使用同一套文件，不使用 firefox 文件夹。</w:t>
+        <w:t>1. 将插件 ZIP 解压到固定目录。</w:t>
+      </w:r>
+    </w:p>
+    <w:p>
+      <w:r>
+        <w:t>2. 完整仓库选择 core 文件夹；单独的 Chrome 插件包选择直接包含 manifest.json 的解压文件夹。</w:t>
+      </w:r>
+    </w:p>
+    <w:p>
+      <w:r>
+        <w:t>3. Edge 和 Chrome 使用同一套文件，不选择 firefox 文件夹。</w:t>
       </w:r>
     </w:p>
     <w:p>
@@ -49,9 +59,15 @@
     <w:p>
       <w:r>
         <w:t>1. 地址栏输入 edge://extensions/，开启“开发人员模式”（部分版本称“开发者模式”）。</w:t>
-        <w:br/>
+      </w:r>
+    </w:p>
+    <w:p>
+      <w:r>
         <w:t>2. 点击“加载解压缩的扩展”或同义的加载按钮，选择上面准备好的插件文件夹。</w:t>
-        <w:br/>
+      </w:r>
+    </w:p>
+    <w:p>
+      <w:r>
         <w:t>3. 确认列表出现 DeepSeek Pilot 且已启用，再打开或刷新 DeepSeek 网页并登录。</w:t>
       </w:r>
     </w:p>
@@ -85,9 +101,15 @@
     <w:p>
       <w:r>
         <w:t>1. 地址栏输入 chrome://extensions/，开启“开发者模式”。</w:t>
-        <w:br/>
+      </w:r>
+    </w:p>
+    <w:p>
+      <w:r>
         <w:t>2. 点击“加载已解压的扩展程序”（也可能显示“加载未打包的扩展程序”），选择同一个插件文件夹。</w:t>
-        <w:br/>
+      </w:r>
+    </w:p>
+    <w:p>
+      <w:r>
         <w:t>3. 确认 DeepSeek Pilot 已启用，打开或刷新 DeepSeek 网页并登录。</w:t>
       </w:r>
     </w:p>
@@ -144,10 +166,16 @@
     <w:p>
       <w:r>
         <w:t>1. 在 DeepSeek 左侧“项目”旁点击加号，创建示例项目“产品策划”。</w:t>
-        <w:br/>
+      </w:r>
+    </w:p>
+    <w:p>
+      <w:r>
         <w:t>2. 打开项目菜单，通过“编辑项目目标”填写目标，例如“整理用户反馈并形成产品方案”。</w:t>
-        <w:br/>
-        <w:t>3. 已有会话：在“未归类会话”的会话菜单中选择“移到项目”。项目菜单还支持重命名、置顶、归档和新建会话。</w:t>
+      </w:r>
+    </w:p>
+    <w:p>
+      <w:r>
+        <w:t>3. 已有会话：在“未归类会话”菜单中选择“移到项目”。</w:t>
       </w:r>
     </w:p>
     <w:p>
@@ -165,7 +193,17 @@
     </w:p>
     <w:p>
       <w:r>
-        <w:t>在项目菜单中选择“新建会话”，发送首条消息前确认已选项目，并开启“项目记忆”。然后发送问题，例如“请根据项目背景列出访谈提纲”。</w:t>
+        <w:t>1. 在项目菜单中选择“新建会话”。</w:t>
+      </w:r>
+    </w:p>
+    <w:p>
+      <w:r>
+        <w:t>2. 确认已选项目，并在发送首条消息前开启“项目记忆”。</w:t>
+      </w:r>
+    </w:p>
+    <w:p>
+      <w:r>
+        <w:t>3. 输入问题，例如“请根据项目背景列出访谈提纲”，然后发送。</w:t>
       </w:r>
     </w:p>
     <w:p>
@@ -203,15 +241,36 @@
     <w:p>
       <w:r>
         <w:t>1. 点击侧边栏“项目”旁的设置齿轮，进入设置与记忆管理页。</w:t>
-        <w:br/>
-        <w:t>2. 在记忆区域选择“个人记忆”或具体项目，按类别查看；点击类别的“编辑”，修改后“保存类别”。清空已有条目会在保存时删除。</w:t>
-        <w:br/>
-        <w:t>3. 通过“更新记忆”主动整理当前范围；每轮回答结束后，插件也会自动整理符合条件的新增或变化会话。</w:t>
       </w:r>
     </w:p>
     <w:p>
       <w:r>
-        <w:t>备份：选择范围 → 更多 → 导出记忆，保存 JSON。恢复：更多 → 导入记忆，选择备份并核对预览。导出仅包含当前范围；项目记忆导入前应先建立同名项目，避免未匹配的项目条目被跳过。</w:t>
+        <w:t>2. 选择个人或项目范围，点击类别“编辑”，修改后点击“保存类别”。</w:t>
+      </w:r>
+    </w:p>
+    <w:p>
+      <w:r>
+        <w:t>3. 点击“更新记忆”主动整理；每轮回答结束后也会自动整理新增或变化的会话。</w:t>
+      </w:r>
+    </w:p>
+    <w:p>
+      <w:r>
+        <w:t>4. 备份记忆：选择范围，点击“更多”→“导出记忆”，保存 JSON 文件。</w:t>
+      </w:r>
+    </w:p>
+    <w:p>
+      <w:r>
+        <w:t>5. 恢复项目记忆前，先建立同名项目，避免未匹配的项目条目被跳过。</w:t>
+      </w:r>
+    </w:p>
+    <w:p>
+      <w:r>
+        <w:t>6. 点击“更多”→“导入记忆”，选择备份文件，核对预览后确认。</w:t>
+      </w:r>
+    </w:p>
+    <w:p>
+      <w:r>
+        <w:t>说明：导出仅包含当前选择的记忆范围。</w:t>
       </w:r>
     </w:p>
     <w:p>
@@ -261,7 +320,22 @@
     </w:p>
     <w:p>
       <w:r>
-        <w:t>进入设置页的“上下文预算”，初次使用可保留默认值：切换会话预算 256,000 token、接续提醒 100%、回答预留 4,000 token。无需为截图故意制造超长对话。</w:t>
+        <w:t>1. 打开设置页，找到“上下文预算”。</w:t>
+      </w:r>
+    </w:p>
+    <w:p>
+      <w:r>
+        <w:t>2. 初次使用保留默认值：预算 256,000 token、提醒 100%、回答预留 4,000 token。</w:t>
+      </w:r>
+    </w:p>
+    <w:p>
+      <w:r>
+        <w:t>3. 在项目中新建会话并开启项目记忆，正常聊天，达到预算时自动接续。</w:t>
+      </w:r>
+    </w:p>
+    <w:p>
+      <w:r>
+        <w:t>说明：无需为截图故意制造超长对话。</w:t>
       </w:r>
     </w:p>
     <w:p>
@@ -274,12 +348,32 @@
     </w:p>
     <w:p>
       <w:r>
-        <w:t>自动化任务依次执行，可在“自动化队列”暂停或继续。记忆整理和压缩任务执行超过 30 秒未完成会跳过，保留已有记忆；可在设置页核对后重试。结果不明时，先核对目标会话和保留草稿，避免重复发送。</w:t>
+        <w:t>1. 在设置页找到“自动化队列”，查看任务状态。</w:t>
       </w:r>
     </w:p>
     <w:p>
       <w:r>
-        <w:t>“聊天显示”可控制个人记忆、项目记忆、消息 token 与时间及自动化会话分组的可见性。关闭显示不等于停止记忆发送或学习。</w:t>
+        <w:t>2. 需要暂停或恢复时，点击“暂停队列”或“继续队列”。</w:t>
+      </w:r>
+    </w:p>
+    <w:p>
+      <w:r>
+        <w:t>3. 任务结果不明时，先核对目标会话和保留草稿，再决定是否重试。</w:t>
+      </w:r>
+    </w:p>
+    <w:p>
+      <w:r>
+        <w:t>说明：记忆整理和压缩执行超过 30 秒未完成会跳过，保留已有记忆。</w:t>
+      </w:r>
+    </w:p>
+    <w:p>
+      <w:r>
+        <w:t>4. 在“聊天显示”中，按需调整记忆、消息 token 与时间、自动化分组的显示。</w:t>
+      </w:r>
+    </w:p>
+    <w:p>
+      <w:r>
+        <w:t>说明：关闭显示不等于停止记忆发送或学习。</w:t>
       </w:r>
     </w:p>
     <w:p>
@@ -311,16 +405,42 @@
     </w:p>
     <w:p>
       <w:r>
-        <w:t>更新：先导出重要记忆，将新文件放回原安装位置，在对应浏览器的扩展管理页点击插件“重新加载”，再刷新 DeepSeek 页面。正常更新不必卸载。</w:t>
+        <w:t>1. 更新前，先导出重要记忆。</w:t>
       </w:r>
     </w:p>
     <w:p>
       <w:r>
-        <w:t>页面没有项目区：确认插件启用且网址为 chat.deepseek.com，再刷新网页。</w:t>
-        <w:br/>
-        <w:t>记忆没有带入：确认已选项目，并在首条消息发送前开启项目记忆。</w:t>
-        <w:br/>
-        <w:t>较早会话找不到：点击“加载更多会话”。当前自动会话归类关闭，需手动移入项目。</w:t>
+        <w:t>2. 将新插件文件放回原安装位置。</w:t>
+      </w:r>
+    </w:p>
+    <w:p>
+      <w:r>
+        <w:t>3. 打开对应浏览器的扩展管理页，点击插件“重新加载”。</w:t>
+      </w:r>
+    </w:p>
+    <w:p>
+      <w:r>
+        <w:t>4. 刷新 DeepSeek 页面。正常更新不必卸载。</w:t>
+      </w:r>
+    </w:p>
+    <w:p>
+      <w:r>
+        <w:t>5. 页面没有项目区：确认插件已启用、网址为 chat.deepseek.com，再刷新。</w:t>
+      </w:r>
+    </w:p>
+    <w:p>
+      <w:r>
+        <w:t>6. 记忆没有带入：确认已选项目，并在首条消息发送前开启项目记忆。</w:t>
+      </w:r>
+    </w:p>
+    <w:p>
+      <w:r>
+        <w:t>7. 较早会话找不到：点击“加载更多会话”。</w:t>
+      </w:r>
+    </w:p>
+    <w:p>
+      <w:r>
+        <w:t>说明：当前自动会话归类关闭，需手动移入项目。</w:t>
       </w:r>
     </w:p>
     <w:p>
@@ -334,18 +454,6 @@
     <w:p>
       <w:r>
         <w:t>记忆在本地保存，但带入、整理和压缩会向 DeepSeek 发送相关内容。Edge 与 Chrome 的本地数据分别保存，迁移需导出、导入。截图请统一使用演示项目和内容，遮挡昵称、账号、真实记忆与私人聊天。</w:t>
-      </w:r>
-    </w:p>
-    <w:p>
-      <w:r>
-        <w:t>全文共需 5 张截图：01 Edge 加载、02 Chrome 加载、03 项目和记忆开关、04 记忆管理、05 设置和队列。插入图片后可删除灰色提示段，保留对应图名。</w:t>
-      </w:r>
-    </w:p>
-    <w:p>
-      <w:r>
-        <w:t>参考：项目 README 与实际界面；Edge 加载方式见微软官方说明：</w:t>
-        <w:br/>
-        <w:t>https://learn.microsoft.com/en-us/microsoft-edge/extensions/getting-started/extension-sideloading</w:t>
       </w:r>
     </w:p>
     <w:sectPr>
@@ -755,7 +863,7 @@
     <w:qFormat/>
     <w:rsid w:val="00FC693F"/>
     <w:pPr>
-      <w:spacing w:line="269" w:lineRule="auto" w:after="120"/>
+      <w:spacing w:line="254" w:lineRule="auto" w:after="40"/>
     </w:pPr>
     <w:rPr>
       <w:rFonts w:ascii="Microsoft YaHei" w:hAnsi="Microsoft YaHei" w:eastAsia="Microsoft YaHei"/>
@@ -818,7 +926,7 @@
     <w:pPr>
       <w:keepNext/>
       <w:keepLines/>
-      <w:spacing w:before="480" w:after="0"/>
+      <w:spacing w:before="180" w:after="100"/>
       <w:outlineLvl w:val="0"/>
     </w:pPr>
     <w:rPr>
@@ -842,7 +950,7 @@
     <w:pPr>
       <w:keepNext/>
       <w:keepLines/>
-      <w:spacing w:before="200" w:after="0"/>
+      <w:spacing w:before="180" w:after="100"/>
       <w:outlineLvl w:val="1"/>
     </w:pPr>
     <w:rPr>

</xml_diff>